<commit_message>
Some Numeric and Problems with Js
</commit_message>
<xml_diff>
--- a/Qs/JAVASCRIPT/Notes.docx
+++ b/Qs/JAVASCRIPT/Notes.docx
@@ -15,7 +15,14 @@
           <w:b/>
           <w:bCs/>
         </w:rPr>
-        <w:t>JAVASCRIPT</w:t>
+        <w:t>J</w:t>
+      </w:r>
+      <w:r>
+        <w:rPr>
+          <w:b/>
+          <w:bCs/>
+        </w:rPr>
+        <w:t>AVASCRIPT</w:t>
       </w:r>
     </w:p>
     <w:p>
@@ -80,15 +87,7 @@
           <w:sz w:val="28"/>
           <w:szCs w:val="28"/>
         </w:rPr>
-        <w:t xml:space="preserve"> programming </w:t>
-      </w:r>
-      <w:proofErr w:type="gramStart"/>
-      <w:r>
-        <w:rPr>
-          <w:sz w:val="28"/>
-          <w:szCs w:val="28"/>
-        </w:rPr>
-        <w:t xml:space="preserve">language </w:t>
+        <w:t xml:space="preserve"> programming language </w:t>
       </w:r>
       <w:r>
         <w:rPr>
@@ -97,7 +96,6 @@
         </w:rPr>
         <w:t>.</w:t>
       </w:r>
-      <w:proofErr w:type="gramEnd"/>
     </w:p>
     <w:p>
       <w:pPr>
@@ -296,23 +294,7 @@
           <w:sz w:val="28"/>
           <w:szCs w:val="28"/>
         </w:rPr>
-        <w:t xml:space="preserve">When it was </w:t>
-      </w:r>
-      <w:proofErr w:type="gramStart"/>
-      <w:r>
-        <w:rPr>
-          <w:sz w:val="28"/>
-          <w:szCs w:val="28"/>
-        </w:rPr>
-        <w:t>introduce</w:t>
-      </w:r>
-      <w:proofErr w:type="gramEnd"/>
-      <w:r>
-        <w:rPr>
-          <w:sz w:val="28"/>
-          <w:szCs w:val="28"/>
-        </w:rPr>
-        <w:t xml:space="preserve"> the name of the </w:t>
+        <w:t xml:space="preserve">When it was introduce the name of the </w:t>
       </w:r>
       <w:proofErr w:type="spellStart"/>
       <w:r>
@@ -328,15 +310,7 @@
           <w:sz w:val="28"/>
           <w:szCs w:val="28"/>
         </w:rPr>
-        <w:t xml:space="preserve"> was MOCHA later it was changed to LIVESCRIPT and after many years finally the name was decided as JavaScript then to </w:t>
-      </w:r>
-      <w:proofErr w:type="gramStart"/>
-      <w:r>
-        <w:rPr>
-          <w:sz w:val="28"/>
-          <w:szCs w:val="28"/>
-        </w:rPr>
-        <w:t xml:space="preserve">JAVSCRIPT </w:t>
+        <w:t xml:space="preserve"> was MOCHA later it was changed to LIVESCRIPT and after many years finally the name was decided as JavaScript then to JAVSCRIPT </w:t>
       </w:r>
       <w:r>
         <w:rPr>
@@ -345,24 +319,22 @@
         </w:rPr>
         <w:t>.</w:t>
       </w:r>
-      <w:proofErr w:type="gramEnd"/>
-    </w:p>
-    <w:p>
-      <w:pPr>
-        <w:rPr>
-          <w:sz w:val="28"/>
-          <w:szCs w:val="28"/>
-        </w:rPr>
-      </w:pPr>
-    </w:p>
-    <w:p>
-      <w:pPr>
-        <w:rPr>
-          <w:sz w:val="28"/>
-          <w:szCs w:val="28"/>
-        </w:rPr>
-      </w:pPr>
-      <w:proofErr w:type="gramStart"/>
+    </w:p>
+    <w:p>
+      <w:pPr>
+        <w:rPr>
+          <w:sz w:val="28"/>
+          <w:szCs w:val="28"/>
+        </w:rPr>
+      </w:pPr>
+    </w:p>
+    <w:p>
+      <w:pPr>
+        <w:rPr>
+          <w:sz w:val="28"/>
+          <w:szCs w:val="28"/>
+        </w:rPr>
+      </w:pPr>
       <w:r>
         <w:rPr>
           <w:sz w:val="28"/>
@@ -370,37 +342,20 @@
         </w:rPr>
         <w:t>Literals :</w:t>
       </w:r>
-      <w:proofErr w:type="gramEnd"/>
-    </w:p>
-    <w:p>
-      <w:pPr>
-        <w:rPr>
-          <w:sz w:val="28"/>
-          <w:szCs w:val="28"/>
-        </w:rPr>
-      </w:pPr>
-      <w:r>
-        <w:rPr>
-          <w:sz w:val="28"/>
-          <w:szCs w:val="28"/>
-        </w:rPr>
-        <w:t xml:space="preserve">The data which we will be storing within a memory location is known as </w:t>
-      </w:r>
-      <w:proofErr w:type="gramStart"/>
-      <w:r>
-        <w:rPr>
-          <w:sz w:val="28"/>
-          <w:szCs w:val="28"/>
-        </w:rPr>
-        <w:t>Literals .</w:t>
-      </w:r>
-      <w:proofErr w:type="gramEnd"/>
-      <w:r>
-        <w:rPr>
-          <w:sz w:val="28"/>
-          <w:szCs w:val="28"/>
-        </w:rPr>
-        <w:t xml:space="preserve"> The constant value that we will be use is </w:t>
+    </w:p>
+    <w:p>
+      <w:pPr>
+        <w:rPr>
+          <w:sz w:val="28"/>
+          <w:szCs w:val="28"/>
+        </w:rPr>
+      </w:pPr>
+      <w:r>
+        <w:rPr>
+          <w:sz w:val="28"/>
+          <w:szCs w:val="28"/>
+        </w:rPr>
+        <w:t xml:space="preserve">The data which we will be storing within a memory location is known as Literals . The constant value that we will be use is </w:t>
       </w:r>
       <w:proofErr w:type="spellStart"/>
       <w:r>
@@ -416,113 +371,61 @@
           <w:sz w:val="28"/>
           <w:szCs w:val="28"/>
         </w:rPr>
-        <w:t xml:space="preserve"> as </w:t>
-      </w:r>
-      <w:proofErr w:type="gramStart"/>
-      <w:r>
-        <w:rPr>
-          <w:sz w:val="28"/>
-          <w:szCs w:val="28"/>
-        </w:rPr>
-        <w:t>literals .</w:t>
-      </w:r>
-      <w:proofErr w:type="gramEnd"/>
-    </w:p>
-    <w:p>
-      <w:pPr>
-        <w:rPr>
-          <w:sz w:val="28"/>
-          <w:szCs w:val="28"/>
-        </w:rPr>
-      </w:pPr>
-      <w:r>
-        <w:rPr>
-          <w:sz w:val="28"/>
-          <w:szCs w:val="28"/>
-        </w:rPr>
-        <w:t>Eg – var name = “Yosho</w:t>
-      </w:r>
-      <w:proofErr w:type="gramStart"/>
-      <w:r>
-        <w:rPr>
-          <w:sz w:val="28"/>
-          <w:szCs w:val="28"/>
-        </w:rPr>
-        <w:t>” ,</w:t>
-      </w:r>
-      <w:proofErr w:type="gramEnd"/>
-      <w:r>
-        <w:rPr>
-          <w:sz w:val="28"/>
-          <w:szCs w:val="28"/>
-        </w:rPr>
-        <w:t xml:space="preserve"> var a = 5</w:t>
-      </w:r>
-    </w:p>
-    <w:p>
-      <w:pPr>
-        <w:rPr>
-          <w:sz w:val="28"/>
-          <w:szCs w:val="28"/>
-        </w:rPr>
-      </w:pPr>
-    </w:p>
-    <w:p>
-      <w:pPr>
-        <w:rPr>
-          <w:sz w:val="28"/>
-          <w:szCs w:val="28"/>
-        </w:rPr>
-      </w:pPr>
-      <w:proofErr w:type="gramStart"/>
-      <w:r>
-        <w:rPr>
-          <w:sz w:val="28"/>
-          <w:szCs w:val="28"/>
-        </w:rPr>
-        <w:t>Datatypes :</w:t>
-      </w:r>
-      <w:proofErr w:type="gramEnd"/>
-      <w:r>
-        <w:rPr>
-          <w:sz w:val="28"/>
-          <w:szCs w:val="28"/>
-        </w:rPr>
-        <w:t xml:space="preserve"> Every data have some type and that type is known as data </w:t>
-      </w:r>
-      <w:proofErr w:type="gramStart"/>
-      <w:r>
-        <w:rPr>
-          <w:sz w:val="28"/>
-          <w:szCs w:val="28"/>
-        </w:rPr>
-        <w:t>type .</w:t>
-      </w:r>
-      <w:proofErr w:type="gramEnd"/>
-    </w:p>
-    <w:p>
-      <w:pPr>
-        <w:rPr>
-          <w:sz w:val="28"/>
-          <w:szCs w:val="28"/>
-        </w:rPr>
-      </w:pPr>
-      <w:r>
-        <w:rPr>
-          <w:sz w:val="28"/>
-          <w:szCs w:val="28"/>
-        </w:rPr>
-        <w:t xml:space="preserve">Datatype will define which type of data a variable can hold or store in its memory </w:t>
-      </w:r>
-      <w:proofErr w:type="gramStart"/>
-      <w:r>
-        <w:rPr>
-          <w:sz w:val="28"/>
-          <w:szCs w:val="28"/>
-        </w:rPr>
-        <w:t>allocations .</w:t>
-      </w:r>
-      <w:proofErr w:type="gramEnd"/>
+        <w:t xml:space="preserve"> as literals .</w:t>
+      </w:r>
+    </w:p>
+    <w:p>
+      <w:pPr>
+        <w:rPr>
+          <w:sz w:val="28"/>
+          <w:szCs w:val="28"/>
+        </w:rPr>
+      </w:pPr>
+      <w:r>
+        <w:rPr>
+          <w:sz w:val="28"/>
+          <w:szCs w:val="28"/>
+        </w:rPr>
+        <w:t>Eg – var name = “Yosho” , var a = 5</w:t>
+      </w:r>
+    </w:p>
+    <w:p>
+      <w:pPr>
+        <w:rPr>
+          <w:sz w:val="28"/>
+          <w:szCs w:val="28"/>
+        </w:rPr>
+      </w:pPr>
+    </w:p>
+    <w:p>
+      <w:pPr>
+        <w:rPr>
+          <w:sz w:val="28"/>
+          <w:szCs w:val="28"/>
+        </w:rPr>
+      </w:pPr>
+      <w:r>
+        <w:rPr>
+          <w:sz w:val="28"/>
+          <w:szCs w:val="28"/>
+        </w:rPr>
+        <w:t>Datatypes : Every data have some type and that type is known as data type .</w:t>
+      </w:r>
+    </w:p>
+    <w:p>
+      <w:pPr>
+        <w:rPr>
+          <w:sz w:val="28"/>
+          <w:szCs w:val="28"/>
+        </w:rPr>
+      </w:pPr>
+      <w:r>
+        <w:rPr>
+          <w:sz w:val="28"/>
+          <w:szCs w:val="28"/>
+        </w:rPr>
+        <w:t>Datatype will define which type of data a variable can hold or store in its memory allocations .</w:t>
+      </w:r>
     </w:p>
     <w:p>
       <w:pPr>
@@ -545,33 +448,8 @@
           <w:sz w:val="28"/>
           <w:szCs w:val="28"/>
         </w:rPr>
-        <w:t xml:space="preserve"> basically provides 2 types of </w:t>
-      </w:r>
-      <w:proofErr w:type="gramStart"/>
-      <w:r>
-        <w:rPr>
-          <w:sz w:val="28"/>
-          <w:szCs w:val="28"/>
-        </w:rPr>
-        <w:t>datatypes :</w:t>
-      </w:r>
-      <w:proofErr w:type="gramEnd"/>
-      <w:r>
-        <w:rPr>
-          <w:sz w:val="28"/>
-          <w:szCs w:val="28"/>
-        </w:rPr>
-        <w:t xml:space="preserve"> Primitive and Non </w:t>
-      </w:r>
-      <w:proofErr w:type="gramStart"/>
-      <w:r>
-        <w:rPr>
-          <w:sz w:val="28"/>
-          <w:szCs w:val="28"/>
-        </w:rPr>
-        <w:t>Primitive .</w:t>
-      </w:r>
-      <w:proofErr w:type="gramEnd"/>
+        <w:t xml:space="preserve"> basically provides 2 types of datatypes : Primitive and Non Primitive .</w:t>
+      </w:r>
     </w:p>
     <w:p>
       <w:pPr>
@@ -609,33 +487,8 @@
           <w:sz w:val="28"/>
           <w:szCs w:val="28"/>
         </w:rPr>
-        <w:t xml:space="preserve">which can store only single </w:t>
-      </w:r>
-      <w:proofErr w:type="gramStart"/>
-      <w:r>
-        <w:rPr>
-          <w:sz w:val="28"/>
-          <w:szCs w:val="28"/>
-        </w:rPr>
-        <w:t>value .</w:t>
-      </w:r>
-      <w:proofErr w:type="gramEnd"/>
-      <w:r>
-        <w:rPr>
-          <w:sz w:val="28"/>
-          <w:szCs w:val="28"/>
-        </w:rPr>
-        <w:t xml:space="preserve"> There are 6 types of </w:t>
-      </w:r>
-      <w:proofErr w:type="gramStart"/>
-      <w:r>
-        <w:rPr>
-          <w:sz w:val="28"/>
-          <w:szCs w:val="28"/>
-        </w:rPr>
-        <w:t>datatypes .</w:t>
-      </w:r>
-      <w:proofErr w:type="gramEnd"/>
+        <w:t>which can store only single value . There are 6 types of datatypes .</w:t>
+      </w:r>
     </w:p>
     <w:p>
       <w:pPr>
@@ -793,49 +646,8 @@
           <w:sz w:val="28"/>
           <w:szCs w:val="28"/>
         </w:rPr>
-        <w:t xml:space="preserve"> non primitive </w:t>
-      </w:r>
-      <w:proofErr w:type="gramStart"/>
-      <w:r>
-        <w:rPr>
-          <w:sz w:val="28"/>
-          <w:szCs w:val="28"/>
-        </w:rPr>
-        <w:t>are</w:t>
-      </w:r>
-      <w:proofErr w:type="gramEnd"/>
-      <w:r>
-        <w:rPr>
-          <w:sz w:val="28"/>
-          <w:szCs w:val="28"/>
-        </w:rPr>
-        <w:t xml:space="preserve"> the data type which can store multiple </w:t>
-      </w:r>
-      <w:proofErr w:type="gramStart"/>
-      <w:r>
-        <w:rPr>
-          <w:sz w:val="28"/>
-          <w:szCs w:val="28"/>
-        </w:rPr>
-        <w:t>value .</w:t>
-      </w:r>
-      <w:proofErr w:type="gramEnd"/>
-      <w:r>
-        <w:rPr>
-          <w:sz w:val="28"/>
-          <w:szCs w:val="28"/>
-        </w:rPr>
-        <w:t xml:space="preserve"> They </w:t>
-      </w:r>
-      <w:proofErr w:type="gramStart"/>
-      <w:r>
-        <w:rPr>
-          <w:sz w:val="28"/>
-          <w:szCs w:val="28"/>
-        </w:rPr>
-        <w:t>are :</w:t>
-      </w:r>
-      <w:proofErr w:type="gramEnd"/>
+        <w:t xml:space="preserve"> non primitive are the data type which can store multiple value . They are :</w:t>
+      </w:r>
     </w:p>
     <w:p>
       <w:pPr>
@@ -869,7 +681,6 @@
           <w:szCs w:val="28"/>
         </w:rPr>
       </w:pPr>
-      <w:proofErr w:type="gramStart"/>
       <w:r>
         <w:rPr>
           <w:sz w:val="28"/>
@@ -882,25 +693,8 @@
           <w:sz w:val="28"/>
           <w:szCs w:val="28"/>
         </w:rPr>
-        <w:t xml:space="preserve"> -</w:t>
-      </w:r>
-      <w:proofErr w:type="gramEnd"/>
-      <w:r>
-        <w:rPr>
-          <w:sz w:val="28"/>
-          <w:szCs w:val="28"/>
-        </w:rPr>
-        <w:t xml:space="preserve"> It can only store homogeneous types of </w:t>
-      </w:r>
-      <w:proofErr w:type="gramStart"/>
-      <w:r>
-        <w:rPr>
-          <w:sz w:val="28"/>
-          <w:szCs w:val="28"/>
-        </w:rPr>
-        <w:t>elements .</w:t>
-      </w:r>
-      <w:proofErr w:type="gramEnd"/>
+        <w:t xml:space="preserve"> - It can only store homogeneous types of elements .</w:t>
+      </w:r>
     </w:p>
     <w:p>
       <w:pPr>
@@ -928,26 +722,16 @@
           <w:sz w:val="28"/>
           <w:szCs w:val="28"/>
         </w:rPr>
-        <w:t xml:space="preserve"> – It will represent a regular </w:t>
-      </w:r>
-      <w:proofErr w:type="gramStart"/>
-      <w:r>
-        <w:rPr>
-          <w:sz w:val="28"/>
-          <w:szCs w:val="28"/>
-        </w:rPr>
-        <w:t>expression .</w:t>
-      </w:r>
-      <w:proofErr w:type="gramEnd"/>
-    </w:p>
-    <w:p>
-      <w:pPr>
-        <w:rPr>
-          <w:sz w:val="28"/>
-          <w:szCs w:val="28"/>
-        </w:rPr>
-      </w:pPr>
-      <w:proofErr w:type="gramStart"/>
+        <w:t xml:space="preserve"> – It will represent a regular expression .</w:t>
+      </w:r>
+    </w:p>
+    <w:p>
+      <w:pPr>
+        <w:rPr>
+          <w:sz w:val="28"/>
+          <w:szCs w:val="28"/>
+        </w:rPr>
+      </w:pPr>
       <w:r>
         <w:rPr>
           <w:sz w:val="28"/>
@@ -955,7 +739,6 @@
         </w:rPr>
         <w:t>Operators :</w:t>
       </w:r>
-      <w:proofErr w:type="gramEnd"/>
     </w:p>
     <w:p>
       <w:pPr>
@@ -985,17 +768,8 @@
           <w:sz w:val="28"/>
           <w:szCs w:val="28"/>
         </w:rPr>
-        <w:t xml:space="preserve"> using which we can perform any operation with the operand(values</w:t>
-      </w:r>
-      <w:proofErr w:type="gramStart"/>
-      <w:r>
-        <w:rPr>
-          <w:sz w:val="28"/>
-          <w:szCs w:val="28"/>
-        </w:rPr>
-        <w:t>) .</w:t>
-      </w:r>
-      <w:proofErr w:type="gramEnd"/>
+        <w:t xml:space="preserve"> using which we can perform any operation with the operand(values) .</w:t>
+      </w:r>
     </w:p>
     <w:p>
       <w:pPr>
@@ -1226,25 +1000,8 @@
           <w:szCs w:val="28"/>
         </w:rPr>
         <w:lastRenderedPageBreak/>
-        <w:t xml:space="preserve">Both divide and modulus operator will perform division operation but both will give different </w:t>
-      </w:r>
-      <w:proofErr w:type="gramStart"/>
-      <w:r>
-        <w:rPr>
-          <w:sz w:val="28"/>
-          <w:szCs w:val="28"/>
-        </w:rPr>
-        <w:t>output .</w:t>
-      </w:r>
-      <w:proofErr w:type="gramEnd"/>
-      <w:r>
-        <w:rPr>
-          <w:sz w:val="28"/>
-          <w:szCs w:val="28"/>
-        </w:rPr>
-        <w:t xml:space="preserve"> As divide operator will give </w:t>
-      </w:r>
-      <w:proofErr w:type="gramStart"/>
+        <w:t xml:space="preserve">Both divide and modulus operator will perform division operation but both will give different output . As divide operator will give </w:t>
+      </w:r>
       <w:r>
         <w:rPr>
           <w:sz w:val="28"/>
@@ -1257,25 +1014,8 @@
           <w:sz w:val="28"/>
           <w:szCs w:val="28"/>
         </w:rPr>
-        <w:t xml:space="preserve"> and</w:t>
-      </w:r>
-      <w:proofErr w:type="gramEnd"/>
-      <w:r>
-        <w:rPr>
-          <w:sz w:val="28"/>
-          <w:szCs w:val="28"/>
-        </w:rPr>
-        <w:t xml:space="preserve"> modulus will give </w:t>
-      </w:r>
-      <w:proofErr w:type="gramStart"/>
-      <w:r>
-        <w:rPr>
-          <w:sz w:val="28"/>
-          <w:szCs w:val="28"/>
-        </w:rPr>
-        <w:t>remainder .</w:t>
-      </w:r>
-      <w:proofErr w:type="gramEnd"/>
+        <w:t xml:space="preserve"> and modulus will give remainder .</w:t>
+      </w:r>
     </w:p>
     <w:p>
       <w:pPr>
@@ -1299,21 +1039,12 @@
         </w:rPr>
         <w:t xml:space="preserve">Assignment Operator </w:t>
       </w:r>
-      <w:proofErr w:type="gramStart"/>
-      <w:r>
-        <w:rPr>
-          <w:sz w:val="28"/>
-          <w:szCs w:val="28"/>
-        </w:rPr>
-        <w:t>( =</w:t>
-      </w:r>
-      <w:proofErr w:type="gramEnd"/>
-      <w:r>
-        <w:rPr>
-          <w:sz w:val="28"/>
-          <w:szCs w:val="28"/>
-        </w:rPr>
-        <w:t xml:space="preserve"> )</w:t>
+      <w:r>
+        <w:rPr>
+          <w:sz w:val="28"/>
+          <w:szCs w:val="28"/>
+        </w:rPr>
+        <w:t>( = )</w:t>
       </w:r>
       <w:r>
         <w:rPr>
@@ -1335,142 +1066,60 @@
           <w:sz w:val="28"/>
           <w:szCs w:val="28"/>
         </w:rPr>
-        <w:t xml:space="preserve">These are the operators which will be used to assign a value to the </w:t>
-      </w:r>
-      <w:proofErr w:type="gramStart"/>
-      <w:r>
-        <w:rPr>
-          <w:sz w:val="28"/>
-          <w:szCs w:val="28"/>
-        </w:rPr>
-        <w:t>variable .</w:t>
-      </w:r>
-      <w:proofErr w:type="gramEnd"/>
-      <w:r>
-        <w:rPr>
-          <w:sz w:val="28"/>
-          <w:szCs w:val="28"/>
-        </w:rPr>
-        <w:t xml:space="preserve"> This operator will be used to assign value to a </w:t>
-      </w:r>
-      <w:proofErr w:type="gramStart"/>
-      <w:r>
-        <w:rPr>
-          <w:sz w:val="28"/>
-          <w:szCs w:val="28"/>
-        </w:rPr>
-        <w:t>variable .</w:t>
-      </w:r>
-      <w:proofErr w:type="gramEnd"/>
-      <w:r>
-        <w:rPr>
-          <w:sz w:val="28"/>
-          <w:szCs w:val="28"/>
-        </w:rPr>
-        <w:t xml:space="preserve"> And it is not used for any comparison purpose.</w:t>
-      </w:r>
-    </w:p>
-    <w:p>
-      <w:pPr>
-        <w:rPr>
-          <w:sz w:val="28"/>
-          <w:szCs w:val="28"/>
-        </w:rPr>
-      </w:pPr>
-    </w:p>
-    <w:p>
-      <w:pPr>
-        <w:rPr>
-          <w:sz w:val="28"/>
-          <w:szCs w:val="28"/>
-        </w:rPr>
-      </w:pPr>
-    </w:p>
-    <w:p>
-      <w:pPr>
-        <w:rPr>
-          <w:sz w:val="28"/>
-          <w:szCs w:val="28"/>
-        </w:rPr>
-      </w:pPr>
-      <w:r>
-        <w:rPr>
-          <w:sz w:val="28"/>
-          <w:szCs w:val="28"/>
-        </w:rPr>
-        <w:t xml:space="preserve">Comparison </w:t>
-      </w:r>
-      <w:proofErr w:type="gramStart"/>
-      <w:r>
-        <w:rPr>
-          <w:sz w:val="28"/>
-          <w:szCs w:val="28"/>
-        </w:rPr>
-        <w:t>Operator :</w:t>
-      </w:r>
-      <w:proofErr w:type="gramEnd"/>
-    </w:p>
-    <w:p>
-      <w:pPr>
-        <w:rPr>
-          <w:sz w:val="28"/>
-          <w:szCs w:val="28"/>
-        </w:rPr>
-      </w:pPr>
-      <w:r>
-        <w:rPr>
-          <w:sz w:val="28"/>
-          <w:szCs w:val="28"/>
-        </w:rPr>
-        <w:t>It is used to compare 2 value and they are =</w:t>
-      </w:r>
-      <w:proofErr w:type="gramStart"/>
-      <w:r>
-        <w:rPr>
-          <w:sz w:val="28"/>
-          <w:szCs w:val="28"/>
-        </w:rPr>
-        <w:t>= ,</w:t>
-      </w:r>
-      <w:proofErr w:type="gramEnd"/>
-      <w:r>
-        <w:rPr>
-          <w:sz w:val="28"/>
-          <w:szCs w:val="28"/>
-        </w:rPr>
-        <w:t xml:space="preserve"> ==</w:t>
-      </w:r>
-      <w:proofErr w:type="gramStart"/>
-      <w:r>
-        <w:rPr>
-          <w:sz w:val="28"/>
-          <w:szCs w:val="28"/>
-        </w:rPr>
-        <w:t>=,!</w:t>
-      </w:r>
-      <w:proofErr w:type="gramEnd"/>
-      <w:r>
-        <w:rPr>
-          <w:sz w:val="28"/>
-          <w:szCs w:val="28"/>
-        </w:rPr>
-        <w:t>=, &gt;</w:t>
-      </w:r>
-      <w:proofErr w:type="gramStart"/>
-      <w:r>
-        <w:rPr>
-          <w:sz w:val="28"/>
-          <w:szCs w:val="28"/>
-        </w:rPr>
-        <w:t>! ,</w:t>
-      </w:r>
-      <w:proofErr w:type="gramEnd"/>
-      <w:r>
-        <w:rPr>
-          <w:sz w:val="28"/>
-          <w:szCs w:val="28"/>
-        </w:rPr>
-        <w:t xml:space="preserve"> &lt;! </w:t>
+        <w:t>These are the operators which will be used to assign a value to the variable .</w:t>
+      </w:r>
+      <w:r>
+        <w:rPr>
+          <w:sz w:val="28"/>
+          <w:szCs w:val="28"/>
+        </w:rPr>
+        <w:t xml:space="preserve"> This operator will be used to assign value to a variable . And it is not used for any comparison purpose.</w:t>
+      </w:r>
+    </w:p>
+    <w:p>
+      <w:pPr>
+        <w:rPr>
+          <w:sz w:val="28"/>
+          <w:szCs w:val="28"/>
+        </w:rPr>
+      </w:pPr>
+    </w:p>
+    <w:p>
+      <w:pPr>
+        <w:rPr>
+          <w:sz w:val="28"/>
+          <w:szCs w:val="28"/>
+        </w:rPr>
+      </w:pPr>
+    </w:p>
+    <w:p>
+      <w:pPr>
+        <w:rPr>
+          <w:sz w:val="28"/>
+          <w:szCs w:val="28"/>
+        </w:rPr>
+      </w:pPr>
+      <w:r>
+        <w:rPr>
+          <w:sz w:val="28"/>
+          <w:szCs w:val="28"/>
+        </w:rPr>
+        <w:t>Comparison Operator :</w:t>
+      </w:r>
+    </w:p>
+    <w:p>
+      <w:pPr>
+        <w:rPr>
+          <w:sz w:val="28"/>
+          <w:szCs w:val="28"/>
+        </w:rPr>
+      </w:pPr>
+      <w:r>
+        <w:rPr>
+          <w:sz w:val="28"/>
+          <w:szCs w:val="28"/>
+        </w:rPr>
+        <w:t xml:space="preserve">It is used to compare 2 value and they are == , ===,!=, &gt;! , &lt;! </w:t>
       </w:r>
     </w:p>
     <w:p>
@@ -1490,15 +1139,7 @@
           <w:sz w:val="28"/>
           <w:szCs w:val="28"/>
         </w:rPr>
-        <w:t xml:space="preserve">== - This operator will compare the values </w:t>
-      </w:r>
-      <w:proofErr w:type="gramStart"/>
-      <w:r>
-        <w:rPr>
-          <w:sz w:val="28"/>
-          <w:szCs w:val="28"/>
-        </w:rPr>
-        <w:t xml:space="preserve">only </w:t>
+        <w:t xml:space="preserve">== - This operator will compare the values only </w:t>
       </w:r>
       <w:r>
         <w:rPr>
@@ -1507,7 +1148,6 @@
         </w:rPr>
         <w:t>.</w:t>
       </w:r>
-      <w:proofErr w:type="gramEnd"/>
     </w:p>
     <w:p>
       <w:pPr>
@@ -1526,17 +1166,8 @@
           <w:sz w:val="28"/>
           <w:szCs w:val="28"/>
         </w:rPr>
-        <w:t xml:space="preserve">=== - It will compare the values as well as its </w:t>
-      </w:r>
-      <w:proofErr w:type="gramStart"/>
-      <w:r>
-        <w:rPr>
-          <w:sz w:val="28"/>
-          <w:szCs w:val="28"/>
-        </w:rPr>
-        <w:t>datatype .</w:t>
-      </w:r>
-      <w:proofErr w:type="gramEnd"/>
+        <w:t>=== - It will compare the values as well as its datatype .</w:t>
+      </w:r>
     </w:p>
     <w:p>
       <w:pPr>
@@ -1550,37 +1181,12 @@
           <w:szCs w:val="28"/>
         </w:rPr>
       </w:pPr>
-      <w:proofErr w:type="gramStart"/>
-      <w:r>
-        <w:rPr>
-          <w:sz w:val="28"/>
-          <w:szCs w:val="28"/>
-        </w:rPr>
-        <w:t>!=</w:t>
-      </w:r>
-      <w:proofErr w:type="gramEnd"/>
-      <w:r>
-        <w:rPr>
-          <w:sz w:val="28"/>
-          <w:szCs w:val="28"/>
-        </w:rPr>
-        <w:t xml:space="preserve"> - It will return true if both the values are </w:t>
-      </w:r>
-      <w:proofErr w:type="gramStart"/>
-      <w:r>
-        <w:rPr>
-          <w:sz w:val="28"/>
-          <w:szCs w:val="28"/>
-        </w:rPr>
-        <w:t>different .</w:t>
-      </w:r>
-      <w:proofErr w:type="gramEnd"/>
-      <w:r>
-        <w:rPr>
-          <w:sz w:val="28"/>
-          <w:szCs w:val="28"/>
-        </w:rPr>
-        <w:t xml:space="preserve"> </w:t>
+      <w:r>
+        <w:rPr>
+          <w:sz w:val="28"/>
+          <w:szCs w:val="28"/>
+        </w:rPr>
+        <w:t xml:space="preserve">!= - It will return true if both the values are different . </w:t>
       </w:r>
     </w:p>
     <w:p>
@@ -1595,31 +1201,13 @@
           <w:szCs w:val="28"/>
         </w:rPr>
       </w:pPr>
-      <w:proofErr w:type="gramStart"/>
-      <w:r>
-        <w:rPr>
-          <w:sz w:val="28"/>
-          <w:szCs w:val="28"/>
-        </w:rPr>
-        <w:t>!=</w:t>
-      </w:r>
-      <w:proofErr w:type="gramEnd"/>
-      <w:r>
-        <w:rPr>
-          <w:sz w:val="28"/>
-          <w:szCs w:val="28"/>
-        </w:rPr>
-        <w:t xml:space="preserve">= - It will return true if both the values and type are </w:t>
-      </w:r>
-      <w:proofErr w:type="gramStart"/>
-      <w:r>
-        <w:rPr>
-          <w:sz w:val="28"/>
-          <w:szCs w:val="28"/>
-        </w:rPr>
-        <w:t>different .</w:t>
-      </w:r>
-      <w:proofErr w:type="gramEnd"/>
+      <w:r>
+        <w:rPr>
+          <w:sz w:val="28"/>
+          <w:szCs w:val="28"/>
+        </w:rPr>
+        <w:t>!== - It will return true if both the values and type are different .</w:t>
+      </w:r>
     </w:p>
     <w:p>
       <w:pPr>
@@ -1677,38 +1265,20 @@
         </w:rPr>
         <w:t>(&amp;&amp;)</w:t>
       </w:r>
-      <w:proofErr w:type="gramStart"/>
-      <w:r>
-        <w:rPr>
-          <w:sz w:val="28"/>
-          <w:szCs w:val="28"/>
-        </w:rPr>
-        <w:t>-  In</w:t>
-      </w:r>
-      <w:proofErr w:type="gramEnd"/>
-      <w:r>
-        <w:rPr>
-          <w:sz w:val="28"/>
-          <w:szCs w:val="28"/>
-        </w:rPr>
-        <w:t xml:space="preserve"> this operator it will execute</w:t>
-      </w:r>
-      <w:r>
-        <w:rPr>
-          <w:sz w:val="28"/>
-          <w:szCs w:val="28"/>
-        </w:rPr>
-        <w:t xml:space="preserve"> the first operand and if gets false then it will never execute the second </w:t>
-      </w:r>
-      <w:proofErr w:type="gramStart"/>
-      <w:r>
-        <w:rPr>
-          <w:sz w:val="28"/>
-          <w:szCs w:val="28"/>
-        </w:rPr>
-        <w:t>statement .</w:t>
-      </w:r>
-      <w:proofErr w:type="gramEnd"/>
+      <w:r>
+        <w:rPr>
+          <w:sz w:val="28"/>
+          <w:szCs w:val="28"/>
+        </w:rPr>
+        <w:t>-  In this operator it will execute</w:t>
+      </w:r>
+      <w:r>
+        <w:rPr>
+          <w:sz w:val="28"/>
+          <w:szCs w:val="28"/>
+        </w:rPr>
+        <w:t xml:space="preserve"> the first operand and if gets false then it will never execute the second statement .</w:t>
+      </w:r>
     </w:p>
     <w:p>
       <w:pPr>
@@ -1725,7 +1295,6 @@
         </w:rPr>
         <w:t>The Second Operand will get executed if and only if the o/p of the 1</w:t>
       </w:r>
-      <w:proofErr w:type="gramStart"/>
       <w:r>
         <w:rPr>
           <w:sz w:val="28"/>
@@ -1739,25 +1308,8 @@
           <w:sz w:val="28"/>
           <w:szCs w:val="28"/>
         </w:rPr>
-        <w:t xml:space="preserve">  operand</w:t>
-      </w:r>
-      <w:proofErr w:type="gramEnd"/>
-      <w:r>
-        <w:rPr>
-          <w:sz w:val="28"/>
-          <w:szCs w:val="28"/>
-        </w:rPr>
-        <w:t xml:space="preserve"> is </w:t>
-      </w:r>
-      <w:proofErr w:type="gramStart"/>
-      <w:r>
-        <w:rPr>
-          <w:sz w:val="28"/>
-          <w:szCs w:val="28"/>
-        </w:rPr>
-        <w:t>true .</w:t>
-      </w:r>
-      <w:proofErr w:type="gramEnd"/>
+        <w:t xml:space="preserve">  operand is true .</w:t>
+      </w:r>
     </w:p>
     <w:p>
       <w:pPr>
@@ -1790,33 +1342,8 @@
           <w:sz w:val="28"/>
           <w:szCs w:val="28"/>
         </w:rPr>
-        <w:t xml:space="preserve"> – It will just reverse the value of the </w:t>
-      </w:r>
-      <w:proofErr w:type="gramStart"/>
-      <w:r>
-        <w:rPr>
-          <w:sz w:val="28"/>
-          <w:szCs w:val="28"/>
-        </w:rPr>
-        <w:t>variable .</w:t>
-      </w:r>
-      <w:proofErr w:type="gramEnd"/>
-      <w:r>
-        <w:rPr>
-          <w:sz w:val="28"/>
-          <w:szCs w:val="28"/>
-        </w:rPr>
-        <w:t xml:space="preserve"> And it is only applicable for Boolean </w:t>
-      </w:r>
-      <w:proofErr w:type="gramStart"/>
-      <w:r>
-        <w:rPr>
-          <w:sz w:val="28"/>
-          <w:szCs w:val="28"/>
-        </w:rPr>
-        <w:t>datatype .</w:t>
-      </w:r>
-      <w:proofErr w:type="gramEnd"/>
+        <w:t xml:space="preserve"> – It will just reverse the value of the variable . And it is only applicable for Boolean datatype .</w:t>
+      </w:r>
     </w:p>
     <w:p>
       <w:pPr>
@@ -1830,7 +1357,6 @@
           <w:szCs w:val="28"/>
         </w:rPr>
       </w:pPr>
-      <w:proofErr w:type="gramStart"/>
       <w:r>
         <w:rPr>
           <w:sz w:val="28"/>
@@ -1843,15 +1369,7 @@
           <w:sz w:val="28"/>
           <w:szCs w:val="28"/>
         </w:rPr>
-        <w:t>(</w:t>
-      </w:r>
-      <w:proofErr w:type="gramEnd"/>
-      <w:r>
-        <w:rPr>
-          <w:sz w:val="28"/>
-          <w:szCs w:val="28"/>
-        </w:rPr>
-        <w:t>||)</w:t>
+        <w:t>(||)</w:t>
       </w:r>
       <w:r>
         <w:rPr>
@@ -1873,17 +1391,8 @@
           <w:sz w:val="28"/>
           <w:szCs w:val="28"/>
         </w:rPr>
-        <w:t xml:space="preserve"> operand is </w:t>
-      </w:r>
-      <w:proofErr w:type="gramStart"/>
-      <w:r>
-        <w:rPr>
-          <w:sz w:val="28"/>
-          <w:szCs w:val="28"/>
-        </w:rPr>
-        <w:t>false .</w:t>
-      </w:r>
-      <w:proofErr w:type="gramEnd"/>
+        <w:t xml:space="preserve"> operand is false .</w:t>
+      </w:r>
     </w:p>
     <w:p>
       <w:pPr>
@@ -1898,33 +1407,8 @@
           <w:sz w:val="28"/>
           <w:szCs w:val="28"/>
         </w:rPr>
-        <w:t xml:space="preserve">Empty statement is </w:t>
-      </w:r>
-      <w:proofErr w:type="gramStart"/>
-      <w:r>
-        <w:rPr>
-          <w:sz w:val="28"/>
-          <w:szCs w:val="28"/>
-        </w:rPr>
-        <w:t>consider</w:t>
-      </w:r>
-      <w:proofErr w:type="gramEnd"/>
-      <w:r>
-        <w:rPr>
-          <w:sz w:val="28"/>
-          <w:szCs w:val="28"/>
-        </w:rPr>
-        <w:t xml:space="preserve"> as a false </w:t>
-      </w:r>
-      <w:proofErr w:type="gramStart"/>
-      <w:r>
-        <w:rPr>
-          <w:sz w:val="28"/>
-          <w:szCs w:val="28"/>
-        </w:rPr>
-        <w:t>statement .</w:t>
-      </w:r>
-      <w:proofErr w:type="gramEnd"/>
+        <w:t>Empty statement is consider as a false statement .</w:t>
+      </w:r>
     </w:p>
     <w:p>
       <w:pPr>
@@ -1944,7 +1428,6 @@
         <w:lastRenderedPageBreak/>
         <w:t xml:space="preserve">Control Flow Statement </w:t>
       </w:r>
-      <w:proofErr w:type="gramStart"/>
       <w:r>
         <w:rPr>
           <w:b/>
@@ -1959,15 +1442,7 @@
           <w:sz w:val="28"/>
           <w:szCs w:val="28"/>
         </w:rPr>
-        <w:t>The</w:t>
-      </w:r>
-      <w:proofErr w:type="gramEnd"/>
-      <w:r>
-        <w:rPr>
-          <w:sz w:val="28"/>
-          <w:szCs w:val="28"/>
-        </w:rPr>
-        <w:t xml:space="preserve"> sequential order in which all the statement are getting executed by the </w:t>
+        <w:t xml:space="preserve">The sequential order in which all the statement are getting executed by the </w:t>
       </w:r>
       <w:proofErr w:type="spellStart"/>
       <w:r>
@@ -1997,23 +1472,7 @@
           <w:sz w:val="28"/>
           <w:szCs w:val="28"/>
         </w:rPr>
-        <w:t xml:space="preserve">is known as control flow </w:t>
-      </w:r>
-      <w:proofErr w:type="gramStart"/>
-      <w:r>
-        <w:rPr>
-          <w:sz w:val="28"/>
-          <w:szCs w:val="28"/>
-        </w:rPr>
-        <w:t>statement .</w:t>
-      </w:r>
-      <w:proofErr w:type="gramEnd"/>
-      <w:r>
-        <w:rPr>
-          <w:sz w:val="28"/>
-          <w:szCs w:val="28"/>
-        </w:rPr>
-        <w:t xml:space="preserve"> </w:t>
+        <w:t xml:space="preserve">is known as control flow statement . </w:t>
       </w:r>
     </w:p>
     <w:p>
@@ -2029,33 +1488,8 @@
           <w:sz w:val="28"/>
           <w:szCs w:val="28"/>
         </w:rPr>
-        <w:t xml:space="preserve">In order to get the o/p according to our requirement we will use flow controlling </w:t>
-      </w:r>
-      <w:proofErr w:type="gramStart"/>
-      <w:r>
-        <w:rPr>
-          <w:sz w:val="28"/>
-          <w:szCs w:val="28"/>
-        </w:rPr>
-        <w:t>statement .</w:t>
-      </w:r>
-      <w:proofErr w:type="gramEnd"/>
-      <w:r>
-        <w:rPr>
-          <w:sz w:val="28"/>
-          <w:szCs w:val="28"/>
-        </w:rPr>
-        <w:t xml:space="preserve"> They </w:t>
-      </w:r>
-      <w:proofErr w:type="gramStart"/>
-      <w:r>
-        <w:rPr>
-          <w:sz w:val="28"/>
-          <w:szCs w:val="28"/>
-        </w:rPr>
-        <w:t>are :</w:t>
-      </w:r>
-      <w:proofErr w:type="gramEnd"/>
+        <w:t>In order to get the o/p according to our requirement we will use flow controlling statement . They are :</w:t>
+      </w:r>
     </w:p>
     <w:p>
       <w:pPr>
@@ -2158,73 +1592,23 @@
           <w:sz w:val="28"/>
           <w:szCs w:val="28"/>
         </w:rPr>
-        <w:t xml:space="preserve">While using this statement we can execute a part of our code while ignoring (not executing) the remaining </w:t>
-      </w:r>
-      <w:proofErr w:type="gramStart"/>
-      <w:r>
-        <w:rPr>
-          <w:sz w:val="28"/>
-          <w:szCs w:val="28"/>
-        </w:rPr>
-        <w:t>part .</w:t>
-      </w:r>
-      <w:proofErr w:type="gramEnd"/>
-    </w:p>
-    <w:p>
-      <w:pPr>
-        <w:rPr>
-          <w:sz w:val="28"/>
-          <w:szCs w:val="28"/>
-        </w:rPr>
-      </w:pPr>
-      <w:r>
-        <w:rPr>
-          <w:sz w:val="28"/>
-          <w:szCs w:val="28"/>
-        </w:rPr>
-        <w:t>If-</w:t>
-      </w:r>
-      <w:proofErr w:type="gramStart"/>
-      <w:r>
-        <w:rPr>
-          <w:sz w:val="28"/>
-          <w:szCs w:val="28"/>
-        </w:rPr>
-        <w:t>else :</w:t>
-      </w:r>
-      <w:proofErr w:type="gramEnd"/>
-      <w:r>
-        <w:rPr>
-          <w:sz w:val="28"/>
-          <w:szCs w:val="28"/>
-        </w:rPr>
-        <w:t xml:space="preserve"> It is a type of conditional statement where the execution will </w:t>
-      </w:r>
-      <w:proofErr w:type="gramStart"/>
-      <w:r>
-        <w:rPr>
-          <w:sz w:val="28"/>
-          <w:szCs w:val="28"/>
-        </w:rPr>
-        <w:t>depends</w:t>
-      </w:r>
-      <w:proofErr w:type="gramEnd"/>
-      <w:r>
-        <w:rPr>
-          <w:sz w:val="28"/>
-          <w:szCs w:val="28"/>
-        </w:rPr>
-        <w:t xml:space="preserve"> upon the o/p of the </w:t>
-      </w:r>
-      <w:proofErr w:type="gramStart"/>
-      <w:r>
-        <w:rPr>
-          <w:sz w:val="28"/>
-          <w:szCs w:val="28"/>
-        </w:rPr>
-        <w:t>condition .</w:t>
-      </w:r>
-      <w:proofErr w:type="gramEnd"/>
+        <w:t>While using this statement we can execute a part of our code while ignoring (not executing) the remaining part .</w:t>
+      </w:r>
+    </w:p>
+    <w:p>
+      <w:pPr>
+        <w:rPr>
+          <w:sz w:val="28"/>
+          <w:szCs w:val="28"/>
+        </w:rPr>
+      </w:pPr>
+      <w:r>
+        <w:rPr>
+          <w:sz w:val="28"/>
+          <w:szCs w:val="28"/>
+        </w:rPr>
+        <w:t>If-else : It is a type of conditional statement where the execution will depends upon the o/p of the condition .</w:t>
+      </w:r>
     </w:p>
     <w:p>
       <w:pPr>
@@ -2254,41 +1638,24 @@
           <w:sz w:val="28"/>
           <w:szCs w:val="28"/>
         </w:rPr>
-        <w:t xml:space="preserve"> if false then else block will be </w:t>
-      </w:r>
-      <w:proofErr w:type="gramStart"/>
-      <w:r>
-        <w:rPr>
-          <w:sz w:val="28"/>
-          <w:szCs w:val="28"/>
-        </w:rPr>
-        <w:t>executed .</w:t>
-      </w:r>
-      <w:proofErr w:type="gramEnd"/>
-      <w:r>
-        <w:rPr>
-          <w:sz w:val="28"/>
-          <w:szCs w:val="28"/>
-        </w:rPr>
-        <w:t xml:space="preserve"> </w:t>
-      </w:r>
-    </w:p>
-    <w:p>
-      <w:pPr>
-        <w:rPr>
-          <w:sz w:val="28"/>
-          <w:szCs w:val="28"/>
-        </w:rPr>
-      </w:pPr>
-    </w:p>
-    <w:p>
-      <w:pPr>
-        <w:rPr>
-          <w:sz w:val="28"/>
-          <w:szCs w:val="28"/>
-        </w:rPr>
-      </w:pPr>
-      <w:proofErr w:type="gramStart"/>
+        <w:t xml:space="preserve"> if false then else block will be executed . </w:t>
+      </w:r>
+    </w:p>
+    <w:p>
+      <w:pPr>
+        <w:rPr>
+          <w:sz w:val="28"/>
+          <w:szCs w:val="28"/>
+        </w:rPr>
+      </w:pPr>
+    </w:p>
+    <w:p>
+      <w:pPr>
+        <w:rPr>
+          <w:sz w:val="28"/>
+          <w:szCs w:val="28"/>
+        </w:rPr>
+      </w:pPr>
       <w:r>
         <w:rPr>
           <w:sz w:val="28"/>
@@ -2296,7 +1663,6 @@
         </w:rPr>
         <w:t>Syntax :</w:t>
       </w:r>
-      <w:proofErr w:type="gramEnd"/>
     </w:p>
     <w:p>
       <w:pPr>
@@ -2321,7 +1687,6 @@
         <w:t>condt</w:t>
       </w:r>
       <w:proofErr w:type="spellEnd"/>
-      <w:proofErr w:type="gramStart"/>
       <w:r>
         <w:rPr>
           <w:sz w:val="28"/>
@@ -2329,7 +1694,6 @@
         </w:rPr>
         <w:t>):{</w:t>
       </w:r>
-      <w:proofErr w:type="gramEnd"/>
     </w:p>
     <w:p>
       <w:pPr>
@@ -2368,7 +1732,6 @@
           <w:szCs w:val="28"/>
         </w:rPr>
       </w:pPr>
-      <w:proofErr w:type="gramStart"/>
       <w:r>
         <w:rPr>
           <w:sz w:val="28"/>
@@ -2381,15 +1744,7 @@
           <w:sz w:val="28"/>
           <w:szCs w:val="28"/>
         </w:rPr>
-        <w:t>lse :</w:t>
-      </w:r>
-      <w:proofErr w:type="gramEnd"/>
-      <w:r>
-        <w:rPr>
-          <w:sz w:val="28"/>
-          <w:szCs w:val="28"/>
-        </w:rPr>
-        <w:t xml:space="preserve"> {</w:t>
+        <w:t>lse : {</w:t>
       </w:r>
     </w:p>
     <w:p>
@@ -2442,17 +1797,8 @@
           <w:sz w:val="28"/>
           <w:szCs w:val="28"/>
         </w:rPr>
-        <w:t xml:space="preserve">In the condition part we can either write Boolean expression directly or we can perform an operation whose o/p will in form of Boolean </w:t>
-      </w:r>
-      <w:proofErr w:type="gramStart"/>
-      <w:r>
-        <w:rPr>
-          <w:sz w:val="28"/>
-          <w:szCs w:val="28"/>
-        </w:rPr>
-        <w:t>expression .</w:t>
-      </w:r>
-      <w:proofErr w:type="gramEnd"/>
+        <w:t>In the condition part we can either write Boolean expression directly or we can perform an operation whose o/p will in form of Boolean expression .</w:t>
+      </w:r>
     </w:p>
     <w:p>
       <w:pPr>
@@ -2467,39 +1813,7 @@
           <w:szCs w:val="28"/>
         </w:rPr>
         <w:lastRenderedPageBreak/>
-        <w:t xml:space="preserve">Else – </w:t>
-      </w:r>
-      <w:proofErr w:type="gramStart"/>
-      <w:r>
-        <w:rPr>
-          <w:sz w:val="28"/>
-          <w:szCs w:val="28"/>
-        </w:rPr>
-        <w:t>if :</w:t>
-      </w:r>
-      <w:proofErr w:type="gramEnd"/>
-      <w:r>
-        <w:rPr>
-          <w:sz w:val="28"/>
-          <w:szCs w:val="28"/>
-        </w:rPr>
-        <w:t xml:space="preserve"> It is a part of if else </w:t>
-      </w:r>
-      <w:proofErr w:type="gramStart"/>
-      <w:r>
-        <w:rPr>
-          <w:sz w:val="28"/>
-          <w:szCs w:val="28"/>
-        </w:rPr>
-        <w:t>statement .</w:t>
-      </w:r>
-      <w:proofErr w:type="gramEnd"/>
-      <w:r>
-        <w:rPr>
-          <w:sz w:val="28"/>
-          <w:szCs w:val="28"/>
-        </w:rPr>
-        <w:t xml:space="preserve"> </w:t>
+        <w:t xml:space="preserve">Else – if : It is a part of if else statement . </w:t>
       </w:r>
       <w:proofErr w:type="spellStart"/>
       <w:r>
@@ -2515,26 +1829,16 @@
           <w:sz w:val="28"/>
           <w:szCs w:val="28"/>
         </w:rPr>
-        <w:t xml:space="preserve"> using it we can achieve multiple choice in if </w:t>
-      </w:r>
-      <w:proofErr w:type="gramStart"/>
-      <w:r>
-        <w:rPr>
-          <w:sz w:val="28"/>
-          <w:szCs w:val="28"/>
-        </w:rPr>
-        <w:t>else .</w:t>
-      </w:r>
-      <w:proofErr w:type="gramEnd"/>
-    </w:p>
-    <w:p>
-      <w:pPr>
-        <w:rPr>
-          <w:sz w:val="28"/>
-          <w:szCs w:val="28"/>
-        </w:rPr>
-      </w:pPr>
-      <w:proofErr w:type="gramStart"/>
+        <w:t xml:space="preserve"> using it we can achieve multiple choice in if else .</w:t>
+      </w:r>
+    </w:p>
+    <w:p>
+      <w:pPr>
+        <w:rPr>
+          <w:sz w:val="28"/>
+          <w:szCs w:val="28"/>
+        </w:rPr>
+      </w:pPr>
       <w:r>
         <w:rPr>
           <w:sz w:val="28"/>
@@ -2542,16 +1846,14 @@
         </w:rPr>
         <w:t>Syntax :</w:t>
       </w:r>
-      <w:proofErr w:type="gramEnd"/>
-    </w:p>
-    <w:p>
-      <w:pPr>
-        <w:rPr>
-          <w:sz w:val="28"/>
-          <w:szCs w:val="28"/>
-        </w:rPr>
-      </w:pPr>
-      <w:proofErr w:type="gramStart"/>
+    </w:p>
+    <w:p>
+      <w:pPr>
+        <w:rPr>
+          <w:sz w:val="28"/>
+          <w:szCs w:val="28"/>
+        </w:rPr>
+      </w:pPr>
       <w:r>
         <w:rPr>
           <w:sz w:val="28"/>
@@ -2560,7 +1862,6 @@
         <w:t>If(</w:t>
       </w:r>
       <w:proofErr w:type="spellStart"/>
-      <w:proofErr w:type="gramEnd"/>
       <w:r>
         <w:rPr>
           <w:sz w:val="28"/>
@@ -2574,17 +1875,8 @@
           <w:sz w:val="28"/>
           <w:szCs w:val="28"/>
         </w:rPr>
-        <w:t xml:space="preserve"> 1</w:t>
-      </w:r>
-      <w:proofErr w:type="gramStart"/>
-      <w:r>
-        <w:rPr>
-          <w:sz w:val="28"/>
-          <w:szCs w:val="28"/>
-        </w:rPr>
-        <w:t>):{</w:t>
-      </w:r>
-      <w:proofErr w:type="gramEnd"/>
+        <w:t xml:space="preserve"> 1):{</w:t>
+      </w:r>
     </w:p>
     <w:p>
       <w:pPr>
@@ -2644,17 +1936,8 @@
           <w:sz w:val="28"/>
           <w:szCs w:val="28"/>
         </w:rPr>
-        <w:t xml:space="preserve"> </w:t>
-      </w:r>
-      <w:proofErr w:type="gramStart"/>
-      <w:r>
-        <w:rPr>
-          <w:sz w:val="28"/>
-          <w:szCs w:val="28"/>
-        </w:rPr>
-        <w:t>2){</w:t>
-      </w:r>
-      <w:proofErr w:type="gramEnd"/>
+        <w:t xml:space="preserve"> 2){</w:t>
+      </w:r>
     </w:p>
     <w:p>
       <w:pPr>
@@ -2699,17 +1982,8 @@
           <w:sz w:val="28"/>
           <w:szCs w:val="28"/>
         </w:rPr>
-        <w:t xml:space="preserve"> </w:t>
-      </w:r>
-      <w:proofErr w:type="gramStart"/>
-      <w:r>
-        <w:rPr>
-          <w:sz w:val="28"/>
-          <w:szCs w:val="28"/>
-        </w:rPr>
-        <w:t>3){</w:t>
-      </w:r>
-      <w:proofErr w:type="gramEnd"/>
+        <w:t xml:space="preserve"> 3){</w:t>
+      </w:r>
     </w:p>
     <w:p>
       <w:pPr>
@@ -2769,17 +2043,8 @@
           <w:sz w:val="28"/>
           <w:szCs w:val="28"/>
         </w:rPr>
-        <w:t xml:space="preserve"> </w:t>
-      </w:r>
-      <w:proofErr w:type="gramStart"/>
-      <w:r>
-        <w:rPr>
-          <w:sz w:val="28"/>
-          <w:szCs w:val="28"/>
-        </w:rPr>
-        <w:t>n){</w:t>
-      </w:r>
-      <w:proofErr w:type="gramEnd"/>
+        <w:t xml:space="preserve"> n){</w:t>
+      </w:r>
     </w:p>
     <w:p>
       <w:pPr>
@@ -2808,23 +2073,7 @@
           <w:sz w:val="28"/>
           <w:szCs w:val="28"/>
         </w:rPr>
-        <w:t>(</w:t>
-      </w:r>
-      <w:proofErr w:type="gramStart"/>
-      <w:r>
-        <w:rPr>
-          <w:sz w:val="28"/>
-          <w:szCs w:val="28"/>
-        </w:rPr>
-        <w:t>Optional )else</w:t>
-      </w:r>
-      <w:proofErr w:type="gramEnd"/>
-      <w:r>
-        <w:rPr>
-          <w:sz w:val="28"/>
-          <w:szCs w:val="28"/>
-        </w:rPr>
-        <w:t xml:space="preserve"> : {</w:t>
+        <w:t>(Optional )else : {</w:t>
       </w:r>
     </w:p>
     <w:p>
@@ -2872,33 +2121,14 @@
           <w:szCs w:val="28"/>
           <w:u w:val="single"/>
         </w:rPr>
-        <w:t xml:space="preserve">Switch </w:t>
-      </w:r>
-      <w:proofErr w:type="gramStart"/>
-      <w:r>
-        <w:rPr>
-          <w:b/>
-          <w:bCs/>
-          <w:sz w:val="28"/>
-          <w:szCs w:val="28"/>
-          <w:u w:val="single"/>
-        </w:rPr>
-        <w:t>Case</w:t>
-      </w:r>
-      <w:r>
-        <w:rPr>
-          <w:sz w:val="28"/>
-          <w:szCs w:val="28"/>
-        </w:rPr>
-        <w:t xml:space="preserve"> :</w:t>
-      </w:r>
-      <w:proofErr w:type="gramEnd"/>
-      <w:r>
-        <w:rPr>
-          <w:sz w:val="28"/>
-          <w:szCs w:val="28"/>
-        </w:rPr>
-        <w:t xml:space="preserve"> It is a multiple choice </w:t>
+        <w:t>Switch Case</w:t>
+      </w:r>
+      <w:r>
+        <w:rPr>
+          <w:sz w:val="28"/>
+          <w:szCs w:val="28"/>
+        </w:rPr>
+        <w:t xml:space="preserve"> : It is a multiple choice </w:t>
       </w:r>
       <w:proofErr w:type="spellStart"/>
       <w:r>
@@ -2937,33 +2167,16 @@
           <w:sz w:val="28"/>
           <w:szCs w:val="28"/>
         </w:rPr>
-        <w:t xml:space="preserve"> / </w:t>
-      </w:r>
-      <w:proofErr w:type="gramStart"/>
-      <w:r>
-        <w:rPr>
-          <w:sz w:val="28"/>
-          <w:szCs w:val="28"/>
-        </w:rPr>
-        <w:t>lock .</w:t>
-      </w:r>
-      <w:proofErr w:type="gramEnd"/>
-      <w:r>
-        <w:rPr>
-          <w:sz w:val="28"/>
-          <w:szCs w:val="28"/>
-        </w:rPr>
-        <w:t xml:space="preserve"> </w:t>
-      </w:r>
-    </w:p>
-    <w:p>
-      <w:pPr>
-        <w:rPr>
-          <w:sz w:val="28"/>
-          <w:szCs w:val="28"/>
-        </w:rPr>
-      </w:pPr>
-      <w:proofErr w:type="gramStart"/>
+        <w:t xml:space="preserve"> / lock . </w:t>
+      </w:r>
+    </w:p>
+    <w:p>
+      <w:pPr>
+        <w:rPr>
+          <w:sz w:val="28"/>
+          <w:szCs w:val="28"/>
+        </w:rPr>
+      </w:pPr>
       <w:r>
         <w:rPr>
           <w:sz w:val="28"/>
@@ -2971,55 +2184,36 @@
         </w:rPr>
         <w:t>Syntax :</w:t>
       </w:r>
-      <w:proofErr w:type="gramEnd"/>
-    </w:p>
-    <w:p>
-      <w:pPr>
-        <w:rPr>
-          <w:sz w:val="28"/>
-          <w:szCs w:val="28"/>
-        </w:rPr>
-      </w:pPr>
-      <w:r>
-        <w:rPr>
-          <w:sz w:val="28"/>
-          <w:szCs w:val="28"/>
-        </w:rPr>
-        <w:t>Switch(expression</w:t>
-      </w:r>
-      <w:proofErr w:type="gramStart"/>
-      <w:r>
-        <w:rPr>
-          <w:sz w:val="28"/>
-          <w:szCs w:val="28"/>
-        </w:rPr>
-        <w:t>){</w:t>
-      </w:r>
-      <w:proofErr w:type="gramEnd"/>
-    </w:p>
-    <w:p>
-      <w:pPr>
-        <w:rPr>
-          <w:sz w:val="28"/>
-          <w:szCs w:val="28"/>
-        </w:rPr>
-      </w:pPr>
-      <w:r>
-        <w:rPr>
-          <w:sz w:val="28"/>
-          <w:szCs w:val="28"/>
-        </w:rPr>
-        <w:t xml:space="preserve">Case </w:t>
-      </w:r>
-      <w:proofErr w:type="gramStart"/>
-      <w:r>
-        <w:rPr>
-          <w:sz w:val="28"/>
-          <w:szCs w:val="28"/>
-        </w:rPr>
-        <w:t>1 :</w:t>
-      </w:r>
-      <w:proofErr w:type="gramEnd"/>
+    </w:p>
+    <w:p>
+      <w:pPr>
+        <w:rPr>
+          <w:sz w:val="28"/>
+          <w:szCs w:val="28"/>
+        </w:rPr>
+      </w:pPr>
+      <w:r>
+        <w:rPr>
+          <w:sz w:val="28"/>
+          <w:szCs w:val="28"/>
+        </w:rPr>
+        <w:t>Switch(expression){</w:t>
+      </w:r>
+    </w:p>
+    <w:p>
+      <w:pPr>
+        <w:rPr>
+          <w:sz w:val="28"/>
+          <w:szCs w:val="28"/>
+        </w:rPr>
+      </w:pPr>
+      <w:r>
+        <w:rPr>
+          <w:sz w:val="28"/>
+          <w:szCs w:val="28"/>
+        </w:rPr>
+        <w:t>Case 1 :</w:t>
+      </w:r>
     </w:p>
     <w:p>
       <w:pPr>
@@ -3073,17 +2267,8 @@
           <w:szCs w:val="28"/>
         </w:rPr>
         <w:lastRenderedPageBreak/>
-        <w:t xml:space="preserve">Case </w:t>
-      </w:r>
-      <w:proofErr w:type="gramStart"/>
-      <w:r>
-        <w:rPr>
-          <w:sz w:val="28"/>
-          <w:szCs w:val="28"/>
-        </w:rPr>
-        <w:t>2 :</w:t>
-      </w:r>
-      <w:proofErr w:type="gramEnd"/>
+        <w:t>Case 2 :</w:t>
+      </w:r>
     </w:p>
     <w:p>
       <w:pPr>
@@ -3199,6 +2384,252 @@
           <w:szCs w:val="28"/>
         </w:rPr>
       </w:pPr>
+    </w:p>
+    <w:p>
+      <w:pPr>
+        <w:rPr>
+          <w:sz w:val="28"/>
+          <w:szCs w:val="28"/>
+        </w:rPr>
+      </w:pPr>
+      <w:r>
+        <w:rPr>
+          <w:sz w:val="28"/>
+          <w:szCs w:val="28"/>
+        </w:rPr>
+        <w:t>Looping Statement –</w:t>
+      </w:r>
+    </w:p>
+    <w:p>
+      <w:pPr>
+        <w:rPr>
+          <w:sz w:val="28"/>
+          <w:szCs w:val="28"/>
+        </w:rPr>
+      </w:pPr>
+      <w:r>
+        <w:rPr>
+          <w:sz w:val="28"/>
+          <w:szCs w:val="28"/>
+        </w:rPr>
+        <w:t>Whenever we know for exact no. of iteration then we will go for “for loop” .</w:t>
+      </w:r>
+    </w:p>
+    <w:p>
+      <w:pPr>
+        <w:rPr>
+          <w:sz w:val="28"/>
+          <w:szCs w:val="28"/>
+        </w:rPr>
+      </w:pPr>
+      <w:r>
+        <w:rPr>
+          <w:sz w:val="28"/>
+          <w:szCs w:val="28"/>
+        </w:rPr>
+        <w:t xml:space="preserve">Syntax – </w:t>
+      </w:r>
+    </w:p>
+    <w:p>
+      <w:pPr>
+        <w:rPr>
+          <w:sz w:val="28"/>
+          <w:szCs w:val="28"/>
+        </w:rPr>
+      </w:pPr>
+      <w:r>
+        <w:rPr>
+          <w:sz w:val="28"/>
+          <w:szCs w:val="28"/>
+        </w:rPr>
+        <w:t>For (</w:t>
+      </w:r>
+      <w:proofErr w:type="spellStart"/>
+      <w:r>
+        <w:rPr>
+          <w:sz w:val="28"/>
+          <w:szCs w:val="28"/>
+        </w:rPr>
+        <w:t>initialization,condition,updatation</w:t>
+      </w:r>
+      <w:proofErr w:type="spellEnd"/>
+      <w:r>
+        <w:rPr>
+          <w:sz w:val="28"/>
+          <w:szCs w:val="28"/>
+        </w:rPr>
+        <w:t>)</w:t>
+      </w:r>
+    </w:p>
+    <w:p>
+      <w:pPr>
+        <w:rPr>
+          <w:sz w:val="28"/>
+          <w:szCs w:val="28"/>
+        </w:rPr>
+      </w:pPr>
+    </w:p>
+    <w:p>
+      <w:pPr>
+        <w:rPr>
+          <w:sz w:val="28"/>
+          <w:szCs w:val="28"/>
+        </w:rPr>
+      </w:pPr>
+      <w:r>
+        <w:rPr>
+          <w:sz w:val="28"/>
+          <w:szCs w:val="28"/>
+        </w:rPr>
+        <w:t>Eg:</w:t>
+      </w:r>
+    </w:p>
+    <w:p>
+      <w:pPr>
+        <w:rPr>
+          <w:sz w:val="28"/>
+          <w:szCs w:val="28"/>
+        </w:rPr>
+      </w:pPr>
+      <w:r>
+        <w:rPr>
+          <w:sz w:val="28"/>
+          <w:szCs w:val="28"/>
+        </w:rPr>
+        <w:t xml:space="preserve">for( var </w:t>
+      </w:r>
+      <w:proofErr w:type="spellStart"/>
+      <w:r>
+        <w:rPr>
+          <w:sz w:val="28"/>
+          <w:szCs w:val="28"/>
+        </w:rPr>
+        <w:t>i</w:t>
+      </w:r>
+      <w:proofErr w:type="spellEnd"/>
+      <w:r>
+        <w:rPr>
+          <w:sz w:val="28"/>
+          <w:szCs w:val="28"/>
+        </w:rPr>
+        <w:t xml:space="preserve"> = 1; </w:t>
+      </w:r>
+      <w:proofErr w:type="spellStart"/>
+      <w:r>
+        <w:rPr>
+          <w:sz w:val="28"/>
+          <w:szCs w:val="28"/>
+        </w:rPr>
+        <w:t>i</w:t>
+      </w:r>
+      <w:proofErr w:type="spellEnd"/>
+      <w:r>
+        <w:rPr>
+          <w:sz w:val="28"/>
+          <w:szCs w:val="28"/>
+        </w:rPr>
+        <w:t xml:space="preserve">&lt;= 5; </w:t>
+      </w:r>
+      <w:proofErr w:type="spellStart"/>
+      <w:r>
+        <w:rPr>
+          <w:sz w:val="28"/>
+          <w:szCs w:val="28"/>
+        </w:rPr>
+        <w:t>i</w:t>
+      </w:r>
+      <w:proofErr w:type="spellEnd"/>
+      <w:r>
+        <w:rPr>
+          <w:sz w:val="28"/>
+          <w:szCs w:val="28"/>
+        </w:rPr>
+        <w:t>++){</w:t>
+      </w:r>
+    </w:p>
+    <w:p>
+      <w:pPr>
+        <w:rPr>
+          <w:sz w:val="28"/>
+          <w:szCs w:val="28"/>
+        </w:rPr>
+      </w:pPr>
+      <w:r>
+        <w:rPr>
+          <w:sz w:val="28"/>
+          <w:szCs w:val="28"/>
+        </w:rPr>
+        <w:t xml:space="preserve">    console.log("Hello " + </w:t>
+      </w:r>
+      <w:proofErr w:type="spellStart"/>
+      <w:r>
+        <w:rPr>
+          <w:sz w:val="28"/>
+          <w:szCs w:val="28"/>
+        </w:rPr>
+        <w:t>i</w:t>
+      </w:r>
+      <w:proofErr w:type="spellEnd"/>
+      <w:r>
+        <w:rPr>
+          <w:sz w:val="28"/>
+          <w:szCs w:val="28"/>
+        </w:rPr>
+        <w:t>);</w:t>
+      </w:r>
+    </w:p>
+    <w:p>
+      <w:pPr>
+        <w:rPr>
+          <w:sz w:val="28"/>
+          <w:szCs w:val="28"/>
+        </w:rPr>
+      </w:pPr>
+      <w:r>
+        <w:rPr>
+          <w:sz w:val="28"/>
+          <w:szCs w:val="28"/>
+        </w:rPr>
+        <w:t>}</w:t>
+      </w:r>
+    </w:p>
+    <w:p>
+      <w:pPr>
+        <w:rPr>
+          <w:sz w:val="28"/>
+          <w:szCs w:val="28"/>
+        </w:rPr>
+      </w:pPr>
+    </w:p>
+    <w:p>
+      <w:pPr>
+        <w:rPr>
+          <w:sz w:val="28"/>
+          <w:szCs w:val="28"/>
+        </w:rPr>
+      </w:pPr>
+      <w:r>
+        <w:rPr>
+          <w:sz w:val="28"/>
+          <w:szCs w:val="28"/>
+        </w:rPr>
+        <w:t>While Loop :</w:t>
+      </w:r>
+    </w:p>
+    <w:p>
+      <w:pPr>
+        <w:rPr>
+          <w:sz w:val="28"/>
+          <w:szCs w:val="28"/>
+        </w:rPr>
+      </w:pPr>
+      <w:r>
+        <w:rPr>
+          <w:sz w:val="28"/>
+          <w:szCs w:val="28"/>
+        </w:rPr>
+        <w:t>Whenever we do not know the exact no. of iteration of a particular code is going to executed then we will use while loop.</w:t>
+      </w:r>
       <w:r>
         <w:rPr>
           <w:sz w:val="28"/>
@@ -3229,6 +2660,14 @@
           <w:szCs w:val="28"/>
         </w:rPr>
       </w:pPr>
+      <w:r>
+        <w:rPr>
+          <w:sz w:val="28"/>
+          <w:szCs w:val="28"/>
+        </w:rPr>
+        <w:lastRenderedPageBreak/>
+        <w:t>Whenever we want to execute our statement irrespective of our condition at least once then we will use do-while loop .</w:t>
+      </w:r>
     </w:p>
     <w:p>
       <w:pPr>

</xml_diff>